<commit_message>
feat: standardize slide 1 candidate details, rewrite objectives with single action verbs, and generate slide-only defense guide
</commit_message>
<xml_diff>
--- a/Yala_LIMS_Slide_Presentation_Explanation_Guide.docx
+++ b/Yala_LIMS_Slide_Presentation_Explanation_Guide.docx
@@ -316,7 +316,7 @@
           <w:color w:val="222222"/>
           <w:sz w:val="20"/>
         </w:rPr>
-        <w:t xml:space="preserve">Golden Delivery Rule: </w:t>
+        <w:t xml:space="preserve">Examiner Feedback Standard: </w:t>
       </w:r>
       <w:r>
         <w:rPr>
@@ -324,7 +324,7 @@
           <w:color w:val="222222"/>
           <w:sz w:val="20"/>
         </w:rPr>
-        <w:t>Never read bullet points off the slide. Bullets are visual summaries for the panel. Say the spoken scripts provided in this guide.</w:t>
+        <w:t>Each objective begins with a single action verb (Analyze, Design, Implement, Evaluate). This directly satisfies examiner academic rubrics.</w:t>
       </w:r>
     </w:p>
     <w:p>
@@ -391,7 +391,7 @@
           <w:color w:val="222222"/>
           <w:sz w:val="20"/>
         </w:rPr>
-        <w:t>Project Title: Laboratory Information Management System for Yala Sub-County Hospital; Candidate: Owuor Collins; Supervisors: Dr. Edwin Ngwawe &amp; Mr. Peter Maina Kariuki.</w:t>
+        <w:t>Project Title: Laboratory Information Management System for Yala Sub-County Hospital; Candidate: Owuor Collins (SCCI/01227/2022); B.Tech IT; SCIT, TUK; Supervisors: Dr. Edwin Ngwawe &amp; Mr. Peter Maina Kariuki; 2025/2026.</w:t>
       </w:r>
     </w:p>
     <w:tbl>
@@ -1012,7 +1012,7 @@
           <w:color w:val="0D9488"/>
           <w:sz w:val="24"/>
         </w:rPr>
-        <w:t>Slide 5: Project Objectives (General &amp; 4 Specific) [03:35 – 04:30 (55s)]</w:t>
+        <w:t>Slide 5: Project Objectives (Single Action Verbs) [03:35 – 04:30 (55s)]</w:t>
       </w:r>
     </w:p>
     <w:p>
@@ -1035,7 +1035,7 @@
           <w:color w:val="222222"/>
           <w:sz w:val="20"/>
         </w:rPr>
-        <w:t>General Objective: Design, develop, and evaluate a web-based LIMS. Specific Objectives: 1. Analyze manual bottlenecks; 2. Design 3-tier architecture &amp; RBAC schema; 3. Develop CPOE ordering, test bench, panic alerts &amp; eCitizen billing; 4. Evaluate via test cases and UAT.</w:t>
+        <w:t>General Objective: Develop a web-based LIMS for Yala Sub-County Hospital. Specific Objectives (Each starts with ONE action verb): 1. Analyze manual workflows; 2. Design 3-tier architecture &amp; RBAC schema; 3. Implement core web modules &amp; eCitizen; 4. Evaluate system performance &amp; UAT.</w:t>
       </w:r>
     </w:p>
     <w:tbl>
@@ -1086,7 +1086,7 @@
                 <w:color w:val="222222"/>
                 <w:sz w:val="20"/>
               </w:rPr>
-              <w:t>"The general objective is to design, develop, and evaluate a web-based LIMS for Yala Sub-County Hospital. We decomposed this into four specific objectives following the software engineering lifecycle: First, analyze manual workflow bottlenecks; second, design a 3-tier architecture, normalized database schema, and role-based access control; third, develop core modules including CPOE ordering, testing bench, and cashless eCitizen settlement; and fourth, evaluate system performance through 14 test cases and User Acceptance Testing."</w:t>
+              <w:t>"Our general objective is to develop a web-based LIMS for Yala Sub-County Hospital to automate workflows, reduce turnaround times, and secure revenue collection. In accordance with academic guidelines, our specific objectives each begin with a single, clear action verb: First, ANALYZE current manual laboratory and billing workflows; second, DESIGN a 3-tier architecture, relational schema, and RBAC model; third, IMPLEMENT core modules for triage, CPOE ordering, bench testing with panic alerts, and eCitizen billing; and fourth, EVALUATE system performance, security, and user acceptance through structured test cases."</w:t>
             </w:r>
           </w:p>
         </w:tc>
@@ -1145,7 +1145,7 @@
                 <w:color w:val="222222"/>
                 <w:sz w:val="20"/>
               </w:rPr>
-              <w:t>Point out the software lifecycle structure: Analyze -&gt; Design -&gt; Develop -&gt; Evaluate.</w:t>
+              <w:t>State the single action verbs clearly: Analyze, Design, Implement, Evaluate. Examiners evaluate this strictly.</w:t>
             </w:r>
           </w:p>
         </w:tc>
@@ -2996,7 +2996,7 @@
           <w:color w:val="222222"/>
           <w:sz w:val="20"/>
         </w:rPr>
-        <w:t>Project Title: Laboratory Information Management System for Yala Sub-County Hospital; Final Project Defense Presentation (Project B); Candidate: Owuor Collins (SCCI/01227/2022); Supervisors: Dr. Edwin Ngwawe &amp; Mr. Peter Maina Kariuki.</w:t>
+        <w:t>Project Title: Laboratory Information Management System for Yala Sub-County Hospital; Final Project Defense Presentation (Project B); Candidate: Owuor Collins (SCCI/01227/2022); B.Tech IT; TUK SCIT; Supervisors: Dr. Edwin Ngwawe &amp; Mr. Peter Maina Kariuki; 2025/2026.</w:t>
       </w:r>
     </w:p>
     <w:tbl>
@@ -3640,7 +3640,7 @@
           <w:color w:val="222222"/>
           <w:sz w:val="20"/>
         </w:rPr>
-        <w:t>General Objective: Design, develop, and evaluate a web-based LIMS. Specific Objectives: 1. Analyze manual bottlenecks; 2. Design 3-tier architecture &amp; RBAC schema; 3. Develop CPOE ordering, test bench, panic alerts &amp; eCitizen billing; 4. Evaluate via 14 test cases and UAT (4.6/5.0).</w:t>
+        <w:t>General Objective: Develop a web-based LIMS for Yala Sub-County Hospital. Specific Objectives (100% Achieved, each with ONE action verb): 1. Analyze manual workflows; 2. Design 3-tier architecture &amp; RBAC schema; 3. Implement core web modules &amp; eCitizen; 4. Evaluate via 14 test cases and UAT (4.6/5.0).</w:t>
       </w:r>
     </w:p>
     <w:tbl>
@@ -3691,7 +3691,7 @@
                 <w:color w:val="222222"/>
                 <w:sz w:val="20"/>
               </w:rPr>
-              <w:t>"Our general objective was to design, develop, and evaluate a web-based LIMS for Yala Sub-County Hospital. I am pleased to report that 100% of our specific objectives were achieved: First, analyzing existing manual bottlenecks; second, designing a 3-tier architecture and relational schema; third, developing core modules including CPOE ordering, bench testing, panic alerts, and eCitizen billing; and fourth, rigorously evaluating system performance through 14 functional test cases and hospital User Acceptance Testing."</w:t>
+              <w:t>"Our general objective was to develop a web-based LIMS for Yala Sub-County Hospital to automate workflows, reduce turnaround times, and secure revenue collection. I am proud to report that 100% of our specific objectives were achieved, each mapped to a single action verb: First, ANALYZE current manual laboratory and billing workflows; second, DESIGN a 3-tier architecture, relational schema, and RBAC model; third, IMPLEMENT core web modules for triage, CPOE ordering, bench testing with panic alerts, and eCitizen billing; and fourth, EVALUATE system performance, security, and user acceptance through 14 test cases and hospital staff feedback."</w:t>
             </w:r>
           </w:p>
         </w:tc>
@@ -3750,7 +3750,7 @@
                 <w:color w:val="222222"/>
                 <w:sz w:val="20"/>
               </w:rPr>
-              <w:t>Say '100% of our specific objectives were achieved'—it shows confidence and completion.</w:t>
+              <w:t>Say '100% of our specific objectives were achieved'—it shows confidence, completion, and academic rigor.</w:t>
             </w:r>
           </w:p>
         </w:tc>

</xml_diff>